<commit_message>
Delivery checklist: mark Neon PITR as deferred by client; broaden optional next steps
</commit_message>
<xml_diff>
--- a/docs/deliverables/MakeReady_Work_Completed_Checklist.docx
+++ b/docs/deliverables/MakeReady_Work_Completed_Checklist.docx
@@ -2505,7 +2505,7 @@
           <w:color w:val="0F172A"/>
           <w:sz w:val="28"/>
         </w:rPr>
-        <w:t>Pending / Agreed Next (security follow-ups)</w:t>
+        <w:t>Optional / Deferred (agreed next steps)</w:t>
       </w:r>
     </w:p>
     <w:p>
@@ -2531,7 +2531,7 @@
           <w:color w:val="475569"/>
           <w:sz w:val="21"/>
         </w:rPr>
-        <w:t>Verify Neon point-in-time-restore retention is at plan maximum (requires interactive Neon login)</w:t>
+        <w:t>Neon point-in-time-restore tuning - deferred by client for now (nightly encrypted offsite backups cover recovery)</w:t>
       </w:r>
     </w:p>
     <w:p>
@@ -2583,7 +2583,33 @@
           <w:color w:val="475569"/>
           <w:sz w:val="21"/>
         </w:rPr>
-        <w:t>Optional: extend WAF rate-limiting to public token routes (/track, /proof, /apply, /schedule)</w:t>
+        <w:t>Optional: extend WAF rate-limiting to the public token routes (/track, /proof, /apply, /schedule)</w:t>
+      </w:r>
+    </w:p>
+    <w:p>
+      <w:pPr>
+        <w:spacing w:after="40"/>
+        <w:ind w:left="360"/>
+      </w:pPr>
+      <w:r>
+        <w:rPr>
+          <w:rFonts w:ascii="Calibri" w:hAnsi="Calibri"/>
+          <w:b w:val="0"/>
+          <w:i w:val="0"/>
+          <w:color w:val="475569"/>
+          <w:sz w:val="22"/>
+        </w:rPr>
+        <w:t xml:space="preserve">☐  </w:t>
+      </w:r>
+      <w:r>
+        <w:rPr>
+          <w:rFonts w:ascii="Calibri" w:hAnsi="Calibri"/>
+          <w:b w:val="0"/>
+          <w:i w:val="0"/>
+          <w:color w:val="475569"/>
+          <w:sz w:val="21"/>
+        </w:rPr>
+        <w:t>Optional: mobile pipeline view and offline support (PWA installable today; offline not yet built)</w:t>
       </w:r>
     </w:p>
     <w:p/>

</xml_diff>